<commit_message>
Added new lesson and done homework - 01.03.2024
</commit_message>
<xml_diff>
--- a/Wortschatz_DE_SRB.docx
+++ b/Wortschatz_DE_SRB.docx
@@ -59,12 +59,12 @@
         <w:tblLook w:val="04A0" w:firstRow="1" w:lastRow="0" w:firstColumn="1" w:lastColumn="0" w:noHBand="0" w:noVBand="1"/>
       </w:tblPr>
       <w:tblGrid>
-        <w:gridCol w:w="606"/>
-        <w:gridCol w:w="2035"/>
-        <w:gridCol w:w="1125"/>
-        <w:gridCol w:w="1125"/>
-        <w:gridCol w:w="1645"/>
-        <w:gridCol w:w="2814"/>
+        <w:gridCol w:w="682"/>
+        <w:gridCol w:w="2111"/>
+        <w:gridCol w:w="1185"/>
+        <w:gridCol w:w="1195"/>
+        <w:gridCol w:w="1668"/>
+        <w:gridCol w:w="2888"/>
       </w:tblGrid>
       <w:tr>
         <w:tc>
@@ -2642,457 +2642,457 @@
                 <w:bCs/>
                 <w:lang w:val="de-DE"/>
               </w:rPr>
+              <w:t>33</w:t>
+            </w:r>
+          </w:p>
+        </w:tc>
+        <w:tc>
+          <w:tcPr>
+            <w:tcW w:w="2111" w:type="dxa"/>
+          </w:tcPr>
+          <w:p>
+            <w:pPr>
+              <w:rPr>
+                <w:b/>
+                <w:bCs/>
+                <w:lang w:val="de-DE"/>
+              </w:rPr>
+            </w:pPr>
+            <w:r>
+              <w:rPr>
+                <w:b/>
+                <w:bCs/>
+                <w:lang w:val="de-DE"/>
+              </w:rPr>
+              <w:t>Faulheit</w:t>
+            </w:r>
+          </w:p>
+        </w:tc>
+        <w:tc>
+          <w:tcPr>
+            <w:tcW w:w="1185" w:type="dxa"/>
+          </w:tcPr>
+          <w:p/>
+        </w:tc>
+        <w:tc>
+          <w:tcPr>
+            <w:tcW w:w="1195" w:type="dxa"/>
+          </w:tcPr>
+          <w:p/>
+        </w:tc>
+        <w:tc>
+          <w:tcPr>
+            <w:tcW w:w="1289" w:type="dxa"/>
+          </w:tcPr>
+          <w:p/>
+        </w:tc>
+        <w:tc>
+          <w:tcPr>
+            <w:tcW w:w="2888" w:type="dxa"/>
+          </w:tcPr>
+          <w:p>
+            <w:r>
+              <w:t>Lenjost</w:t>
+            </w:r>
+          </w:p>
+        </w:tc>
+      </w:tr>
+      <w:tr>
+        <w:tc>
+          <w:tcPr>
+            <w:tcW w:w="682" w:type="dxa"/>
+          </w:tcPr>
+          <w:p>
+            <w:pPr>
+              <w:jc w:val="center"/>
+              <w:rPr>
+                <w:b/>
+                <w:bCs/>
+                <w:lang w:val="de-DE"/>
+              </w:rPr>
+            </w:pPr>
+            <w:r>
+              <w:rPr>
+                <w:b/>
+                <w:bCs/>
+                <w:lang w:val="de-DE"/>
+              </w:rPr>
+              <w:t>34</w:t>
+            </w:r>
+          </w:p>
+        </w:tc>
+        <w:tc>
+          <w:tcPr>
+            <w:tcW w:w="2111" w:type="dxa"/>
+          </w:tcPr>
+          <w:p>
+            <w:pPr>
+              <w:rPr>
+                <w:b/>
+                <w:bCs/>
+                <w:lang w:val="de-DE"/>
+              </w:rPr>
+            </w:pPr>
+            <w:r>
+              <w:rPr>
+                <w:b/>
+                <w:bCs/>
+                <w:lang w:val="de-DE"/>
+              </w:rPr>
+              <w:t>Die Tugend</w:t>
+            </w:r>
+          </w:p>
+        </w:tc>
+        <w:tc>
+          <w:tcPr>
+            <w:tcW w:w="1185" w:type="dxa"/>
+          </w:tcPr>
+          <w:p/>
+        </w:tc>
+        <w:tc>
+          <w:tcPr>
+            <w:tcW w:w="1195" w:type="dxa"/>
+          </w:tcPr>
+          <w:p/>
+        </w:tc>
+        <w:tc>
+          <w:tcPr>
+            <w:tcW w:w="1289" w:type="dxa"/>
+          </w:tcPr>
+          <w:p/>
+        </w:tc>
+        <w:tc>
+          <w:tcPr>
+            <w:tcW w:w="2888" w:type="dxa"/>
+          </w:tcPr>
+          <w:p>
+            <w:r>
+              <w:t>Vrlina</w:t>
+            </w:r>
+          </w:p>
+        </w:tc>
+      </w:tr>
+      <w:tr>
+        <w:tc>
+          <w:tcPr>
+            <w:tcW w:w="682" w:type="dxa"/>
+          </w:tcPr>
+          <w:p>
+            <w:pPr>
+              <w:jc w:val="center"/>
+              <w:rPr>
+                <w:b/>
+                <w:bCs/>
+                <w:lang w:val="de-DE"/>
+              </w:rPr>
+            </w:pPr>
+            <w:r>
+              <w:rPr>
+                <w:b/>
+                <w:bCs/>
+                <w:lang w:val="de-DE"/>
+              </w:rPr>
+              <w:t>35</w:t>
+            </w:r>
+          </w:p>
+        </w:tc>
+        <w:tc>
+          <w:tcPr>
+            <w:tcW w:w="2111" w:type="dxa"/>
+          </w:tcPr>
+          <w:p>
+            <w:pPr>
+              <w:rPr>
+                <w:b/>
+                <w:bCs/>
+                <w:lang w:val="de-DE"/>
+              </w:rPr>
+            </w:pPr>
+            <w:r>
+              <w:rPr>
+                <w:b/>
+                <w:bCs/>
+                <w:lang w:val="de-DE"/>
+              </w:rPr>
+              <w:t>Normaleweise</w:t>
+            </w:r>
+          </w:p>
+        </w:tc>
+        <w:tc>
+          <w:tcPr>
+            <w:tcW w:w="1185" w:type="dxa"/>
+          </w:tcPr>
+          <w:p/>
+        </w:tc>
+        <w:tc>
+          <w:tcPr>
+            <w:tcW w:w="1195" w:type="dxa"/>
+          </w:tcPr>
+          <w:p/>
+        </w:tc>
+        <w:tc>
+          <w:tcPr>
+            <w:tcW w:w="1289" w:type="dxa"/>
+          </w:tcPr>
+          <w:p/>
+        </w:tc>
+        <w:tc>
+          <w:tcPr>
+            <w:tcW w:w="2888" w:type="dxa"/>
+          </w:tcPr>
+          <w:p>
+            <w:r>
+              <w:t>Uobicajeno, normalno</w:t>
+            </w:r>
+          </w:p>
+        </w:tc>
+      </w:tr>
+      <w:tr>
+        <w:tc>
+          <w:tcPr>
+            <w:tcW w:w="682" w:type="dxa"/>
+          </w:tcPr>
+          <w:p>
+            <w:pPr>
+              <w:jc w:val="center"/>
+              <w:rPr>
+                <w:b/>
+                <w:bCs/>
+                <w:lang w:val="de-DE"/>
+              </w:rPr>
+            </w:pPr>
+            <w:r>
+              <w:rPr>
+                <w:b/>
+                <w:bCs/>
+                <w:lang w:val="de-DE"/>
+              </w:rPr>
+              <w:t>36</w:t>
+            </w:r>
+          </w:p>
+        </w:tc>
+        <w:tc>
+          <w:tcPr>
+            <w:tcW w:w="2111" w:type="dxa"/>
+          </w:tcPr>
+          <w:p>
+            <w:pPr>
+              <w:rPr>
+                <w:b/>
+                <w:bCs/>
+                <w:lang w:val="de-DE"/>
+              </w:rPr>
+            </w:pPr>
+            <w:r>
+              <w:rPr>
+                <w:b/>
+                <w:bCs/>
+                <w:lang w:val="de-DE"/>
+              </w:rPr>
+              <w:t>Gewöhnlich</w:t>
+            </w:r>
+          </w:p>
+        </w:tc>
+        <w:tc>
+          <w:tcPr>
+            <w:tcW w:w="1185" w:type="dxa"/>
+          </w:tcPr>
+          <w:p/>
+        </w:tc>
+        <w:tc>
+          <w:tcPr>
+            <w:tcW w:w="1195" w:type="dxa"/>
+          </w:tcPr>
+          <w:p/>
+        </w:tc>
+        <w:tc>
+          <w:tcPr>
+            <w:tcW w:w="1289" w:type="dxa"/>
+          </w:tcPr>
+          <w:p/>
+        </w:tc>
+        <w:tc>
+          <w:tcPr>
+            <w:tcW w:w="2888" w:type="dxa"/>
+          </w:tcPr>
+          <w:p>
+            <w:r>
+              <w:t>Uobicajeno, normalno</w:t>
+            </w:r>
+          </w:p>
+        </w:tc>
+      </w:tr>
+      <w:tr>
+        <w:tc>
+          <w:tcPr>
+            <w:tcW w:w="682" w:type="dxa"/>
+          </w:tcPr>
+          <w:p>
+            <w:pPr>
+              <w:jc w:val="center"/>
+              <w:rPr>
+                <w:b/>
+                <w:bCs/>
+                <w:lang w:val="de-DE"/>
+              </w:rPr>
+            </w:pPr>
+            <w:r>
+              <w:rPr>
+                <w:b/>
+                <w:bCs/>
+                <w:lang w:val="de-DE"/>
+              </w:rPr>
+              <w:t>37</w:t>
+            </w:r>
+          </w:p>
+        </w:tc>
+        <w:tc>
+          <w:tcPr>
+            <w:tcW w:w="2111" w:type="dxa"/>
+          </w:tcPr>
+          <w:p>
+            <w:pPr>
+              <w:rPr>
+                <w:b/>
+                <w:bCs/>
+                <w:lang w:val="de-DE"/>
+              </w:rPr>
+            </w:pPr>
+            <w:r>
+              <w:rPr>
+                <w:b/>
+                <w:bCs/>
+                <w:lang w:val="de-DE"/>
+              </w:rPr>
+              <w:t>in der Regel</w:t>
+            </w:r>
+          </w:p>
+        </w:tc>
+        <w:tc>
+          <w:tcPr>
+            <w:tcW w:w="1185" w:type="dxa"/>
+          </w:tcPr>
+          <w:p/>
+        </w:tc>
+        <w:tc>
+          <w:tcPr>
+            <w:tcW w:w="1195" w:type="dxa"/>
+          </w:tcPr>
+          <w:p/>
+        </w:tc>
+        <w:tc>
+          <w:tcPr>
+            <w:tcW w:w="1289" w:type="dxa"/>
+          </w:tcPr>
+          <w:p/>
+        </w:tc>
+        <w:tc>
+          <w:tcPr>
+            <w:tcW w:w="2888" w:type="dxa"/>
+          </w:tcPr>
+          <w:p>
+            <w:r>
+              <w:t>Uobicajeno, normalno, po pravilu</w:t>
+            </w:r>
+          </w:p>
+        </w:tc>
+      </w:tr>
+      <w:tr>
+        <w:tc>
+          <w:tcPr>
+            <w:tcW w:w="682" w:type="dxa"/>
+          </w:tcPr>
+          <w:p>
+            <w:pPr>
+              <w:jc w:val="center"/>
+              <w:rPr>
+                <w:b/>
+                <w:bCs/>
+                <w:lang w:val="de-DE"/>
+              </w:rPr>
+            </w:pPr>
+            <w:r>
+              <w:rPr>
+                <w:b/>
+                <w:bCs/>
+                <w:lang w:val="de-DE"/>
+              </w:rPr>
+              <w:t>38</w:t>
+            </w:r>
+          </w:p>
+        </w:tc>
+        <w:tc>
+          <w:tcPr>
+            <w:tcW w:w="2111" w:type="dxa"/>
+          </w:tcPr>
+          <w:p>
+            <w:pPr>
+              <w:rPr>
+                <w:b/>
+                <w:bCs/>
+                <w:lang w:val="de-DE"/>
+              </w:rPr>
+            </w:pPr>
+            <w:r>
+              <w:rPr>
+                <w:b/>
+                <w:bCs/>
+                <w:lang w:val="de-DE"/>
+              </w:rPr>
+              <w:t>Eher</w:t>
+            </w:r>
+          </w:p>
+        </w:tc>
+        <w:tc>
+          <w:tcPr>
+            <w:tcW w:w="1185" w:type="dxa"/>
+          </w:tcPr>
+          <w:p/>
+        </w:tc>
+        <w:tc>
+          <w:tcPr>
+            <w:tcW w:w="1195" w:type="dxa"/>
+          </w:tcPr>
+          <w:p/>
+        </w:tc>
+        <w:tc>
+          <w:tcPr>
+            <w:tcW w:w="1289" w:type="dxa"/>
+          </w:tcPr>
+          <w:p/>
+        </w:tc>
+        <w:tc>
+          <w:tcPr>
+            <w:tcW w:w="2888" w:type="dxa"/>
+          </w:tcPr>
+          <w:p>
+            <w:r>
+              <w:t>Radije</w:t>
+            </w:r>
+          </w:p>
+        </w:tc>
+      </w:tr>
+      <w:tr>
+        <w:tc>
+          <w:tcPr>
+            <w:tcW w:w="682" w:type="dxa"/>
+          </w:tcPr>
+          <w:p>
+            <w:pPr>
+              <w:jc w:val="center"/>
+              <w:rPr>
+                <w:b/>
+                <w:bCs/>
+                <w:lang w:val="de-DE"/>
+              </w:rPr>
+            </w:pPr>
+            <w:r>
+              <w:rPr>
+                <w:b/>
+                <w:bCs/>
+                <w:lang w:val="de-DE"/>
+              </w:rPr>
               <w:lastRenderedPageBreak/>
-              <w:t>33</w:t>
-            </w:r>
-          </w:p>
-        </w:tc>
-        <w:tc>
-          <w:tcPr>
-            <w:tcW w:w="2111" w:type="dxa"/>
-          </w:tcPr>
-          <w:p>
-            <w:pPr>
-              <w:rPr>
-                <w:b/>
-                <w:bCs/>
-                <w:lang w:val="de-DE"/>
-              </w:rPr>
-            </w:pPr>
-            <w:r>
-              <w:rPr>
-                <w:b/>
-                <w:bCs/>
-                <w:lang w:val="de-DE"/>
-              </w:rPr>
-              <w:t>Faulheit</w:t>
-            </w:r>
-          </w:p>
-        </w:tc>
-        <w:tc>
-          <w:tcPr>
-            <w:tcW w:w="1185" w:type="dxa"/>
-          </w:tcPr>
-          <w:p/>
-        </w:tc>
-        <w:tc>
-          <w:tcPr>
-            <w:tcW w:w="1195" w:type="dxa"/>
-          </w:tcPr>
-          <w:p/>
-        </w:tc>
-        <w:tc>
-          <w:tcPr>
-            <w:tcW w:w="1289" w:type="dxa"/>
-          </w:tcPr>
-          <w:p/>
-        </w:tc>
-        <w:tc>
-          <w:tcPr>
-            <w:tcW w:w="2888" w:type="dxa"/>
-          </w:tcPr>
-          <w:p>
-            <w:r>
-              <w:t>Lenjost</w:t>
-            </w:r>
-          </w:p>
-        </w:tc>
-      </w:tr>
-      <w:tr>
-        <w:tc>
-          <w:tcPr>
-            <w:tcW w:w="682" w:type="dxa"/>
-          </w:tcPr>
-          <w:p>
-            <w:pPr>
-              <w:jc w:val="center"/>
-              <w:rPr>
-                <w:b/>
-                <w:bCs/>
-                <w:lang w:val="de-DE"/>
-              </w:rPr>
-            </w:pPr>
-            <w:r>
-              <w:rPr>
-                <w:b/>
-                <w:bCs/>
-                <w:lang w:val="de-DE"/>
-              </w:rPr>
-              <w:t>34</w:t>
-            </w:r>
-          </w:p>
-        </w:tc>
-        <w:tc>
-          <w:tcPr>
-            <w:tcW w:w="2111" w:type="dxa"/>
-          </w:tcPr>
-          <w:p>
-            <w:pPr>
-              <w:rPr>
-                <w:b/>
-                <w:bCs/>
-                <w:lang w:val="de-DE"/>
-              </w:rPr>
-            </w:pPr>
-            <w:r>
-              <w:rPr>
-                <w:b/>
-                <w:bCs/>
-                <w:lang w:val="de-DE"/>
-              </w:rPr>
-              <w:t>Die Tugend</w:t>
-            </w:r>
-          </w:p>
-        </w:tc>
-        <w:tc>
-          <w:tcPr>
-            <w:tcW w:w="1185" w:type="dxa"/>
-          </w:tcPr>
-          <w:p/>
-        </w:tc>
-        <w:tc>
-          <w:tcPr>
-            <w:tcW w:w="1195" w:type="dxa"/>
-          </w:tcPr>
-          <w:p/>
-        </w:tc>
-        <w:tc>
-          <w:tcPr>
-            <w:tcW w:w="1289" w:type="dxa"/>
-          </w:tcPr>
-          <w:p/>
-        </w:tc>
-        <w:tc>
-          <w:tcPr>
-            <w:tcW w:w="2888" w:type="dxa"/>
-          </w:tcPr>
-          <w:p>
-            <w:r>
-              <w:t>Vrlina</w:t>
-            </w:r>
-          </w:p>
-        </w:tc>
-      </w:tr>
-      <w:tr>
-        <w:tc>
-          <w:tcPr>
-            <w:tcW w:w="682" w:type="dxa"/>
-          </w:tcPr>
-          <w:p>
-            <w:pPr>
-              <w:jc w:val="center"/>
-              <w:rPr>
-                <w:b/>
-                <w:bCs/>
-                <w:lang w:val="de-DE"/>
-              </w:rPr>
-            </w:pPr>
-            <w:r>
-              <w:rPr>
-                <w:b/>
-                <w:bCs/>
-                <w:lang w:val="de-DE"/>
-              </w:rPr>
-              <w:t>35</w:t>
-            </w:r>
-          </w:p>
-        </w:tc>
-        <w:tc>
-          <w:tcPr>
-            <w:tcW w:w="2111" w:type="dxa"/>
-          </w:tcPr>
-          <w:p>
-            <w:pPr>
-              <w:rPr>
-                <w:b/>
-                <w:bCs/>
-                <w:lang w:val="de-DE"/>
-              </w:rPr>
-            </w:pPr>
-            <w:r>
-              <w:rPr>
-                <w:b/>
-                <w:bCs/>
-                <w:lang w:val="de-DE"/>
-              </w:rPr>
-              <w:t>Normaleweise</w:t>
-            </w:r>
-          </w:p>
-        </w:tc>
-        <w:tc>
-          <w:tcPr>
-            <w:tcW w:w="1185" w:type="dxa"/>
-          </w:tcPr>
-          <w:p/>
-        </w:tc>
-        <w:tc>
-          <w:tcPr>
-            <w:tcW w:w="1195" w:type="dxa"/>
-          </w:tcPr>
-          <w:p/>
-        </w:tc>
-        <w:tc>
-          <w:tcPr>
-            <w:tcW w:w="1289" w:type="dxa"/>
-          </w:tcPr>
-          <w:p/>
-        </w:tc>
-        <w:tc>
-          <w:tcPr>
-            <w:tcW w:w="2888" w:type="dxa"/>
-          </w:tcPr>
-          <w:p>
-            <w:r>
-              <w:t>Uobicajeno, normalno</w:t>
-            </w:r>
-          </w:p>
-        </w:tc>
-      </w:tr>
-      <w:tr>
-        <w:tc>
-          <w:tcPr>
-            <w:tcW w:w="682" w:type="dxa"/>
-          </w:tcPr>
-          <w:p>
-            <w:pPr>
-              <w:jc w:val="center"/>
-              <w:rPr>
-                <w:b/>
-                <w:bCs/>
-                <w:lang w:val="de-DE"/>
-              </w:rPr>
-            </w:pPr>
-            <w:r>
-              <w:rPr>
-                <w:b/>
-                <w:bCs/>
-                <w:lang w:val="de-DE"/>
-              </w:rPr>
-              <w:t>36</w:t>
-            </w:r>
-          </w:p>
-        </w:tc>
-        <w:tc>
-          <w:tcPr>
-            <w:tcW w:w="2111" w:type="dxa"/>
-          </w:tcPr>
-          <w:p>
-            <w:pPr>
-              <w:rPr>
-                <w:b/>
-                <w:bCs/>
-                <w:lang w:val="de-DE"/>
-              </w:rPr>
-            </w:pPr>
-            <w:r>
-              <w:rPr>
-                <w:b/>
-                <w:bCs/>
-                <w:lang w:val="de-DE"/>
-              </w:rPr>
-              <w:t>Gewöhnlich</w:t>
-            </w:r>
-          </w:p>
-        </w:tc>
-        <w:tc>
-          <w:tcPr>
-            <w:tcW w:w="1185" w:type="dxa"/>
-          </w:tcPr>
-          <w:p/>
-        </w:tc>
-        <w:tc>
-          <w:tcPr>
-            <w:tcW w:w="1195" w:type="dxa"/>
-          </w:tcPr>
-          <w:p/>
-        </w:tc>
-        <w:tc>
-          <w:tcPr>
-            <w:tcW w:w="1289" w:type="dxa"/>
-          </w:tcPr>
-          <w:p/>
-        </w:tc>
-        <w:tc>
-          <w:tcPr>
-            <w:tcW w:w="2888" w:type="dxa"/>
-          </w:tcPr>
-          <w:p>
-            <w:r>
-              <w:t>Uobicajeno, normalno</w:t>
-            </w:r>
-          </w:p>
-        </w:tc>
-      </w:tr>
-      <w:tr>
-        <w:tc>
-          <w:tcPr>
-            <w:tcW w:w="682" w:type="dxa"/>
-          </w:tcPr>
-          <w:p>
-            <w:pPr>
-              <w:jc w:val="center"/>
-              <w:rPr>
-                <w:b/>
-                <w:bCs/>
-                <w:lang w:val="de-DE"/>
-              </w:rPr>
-            </w:pPr>
-            <w:r>
-              <w:rPr>
-                <w:b/>
-                <w:bCs/>
-                <w:lang w:val="de-DE"/>
-              </w:rPr>
-              <w:t>37</w:t>
-            </w:r>
-          </w:p>
-        </w:tc>
-        <w:tc>
-          <w:tcPr>
-            <w:tcW w:w="2111" w:type="dxa"/>
-          </w:tcPr>
-          <w:p>
-            <w:pPr>
-              <w:rPr>
-                <w:b/>
-                <w:bCs/>
-                <w:lang w:val="de-DE"/>
-              </w:rPr>
-            </w:pPr>
-            <w:r>
-              <w:rPr>
-                <w:b/>
-                <w:bCs/>
-                <w:lang w:val="de-DE"/>
-              </w:rPr>
-              <w:t>in der Regel</w:t>
-            </w:r>
-          </w:p>
-        </w:tc>
-        <w:tc>
-          <w:tcPr>
-            <w:tcW w:w="1185" w:type="dxa"/>
-          </w:tcPr>
-          <w:p/>
-        </w:tc>
-        <w:tc>
-          <w:tcPr>
-            <w:tcW w:w="1195" w:type="dxa"/>
-          </w:tcPr>
-          <w:p/>
-        </w:tc>
-        <w:tc>
-          <w:tcPr>
-            <w:tcW w:w="1289" w:type="dxa"/>
-          </w:tcPr>
-          <w:p/>
-        </w:tc>
-        <w:tc>
-          <w:tcPr>
-            <w:tcW w:w="2888" w:type="dxa"/>
-          </w:tcPr>
-          <w:p>
-            <w:r>
-              <w:t>Uobicajeno, normalno, po pravilu</w:t>
-            </w:r>
-          </w:p>
-        </w:tc>
-      </w:tr>
-      <w:tr>
-        <w:tc>
-          <w:tcPr>
-            <w:tcW w:w="682" w:type="dxa"/>
-          </w:tcPr>
-          <w:p>
-            <w:pPr>
-              <w:jc w:val="center"/>
-              <w:rPr>
-                <w:b/>
-                <w:bCs/>
-                <w:lang w:val="de-DE"/>
-              </w:rPr>
-            </w:pPr>
-            <w:r>
-              <w:rPr>
-                <w:b/>
-                <w:bCs/>
-                <w:lang w:val="de-DE"/>
-              </w:rPr>
-              <w:t>38</w:t>
-            </w:r>
-          </w:p>
-        </w:tc>
-        <w:tc>
-          <w:tcPr>
-            <w:tcW w:w="2111" w:type="dxa"/>
-          </w:tcPr>
-          <w:p>
-            <w:pPr>
-              <w:rPr>
-                <w:b/>
-                <w:bCs/>
-                <w:lang w:val="de-DE"/>
-              </w:rPr>
-            </w:pPr>
-            <w:r>
-              <w:rPr>
-                <w:b/>
-                <w:bCs/>
-                <w:lang w:val="de-DE"/>
-              </w:rPr>
-              <w:t>Eher</w:t>
-            </w:r>
-          </w:p>
-        </w:tc>
-        <w:tc>
-          <w:tcPr>
-            <w:tcW w:w="1185" w:type="dxa"/>
-          </w:tcPr>
-          <w:p/>
-        </w:tc>
-        <w:tc>
-          <w:tcPr>
-            <w:tcW w:w="1195" w:type="dxa"/>
-          </w:tcPr>
-          <w:p/>
-        </w:tc>
-        <w:tc>
-          <w:tcPr>
-            <w:tcW w:w="1289" w:type="dxa"/>
-          </w:tcPr>
-          <w:p/>
-        </w:tc>
-        <w:tc>
-          <w:tcPr>
-            <w:tcW w:w="2888" w:type="dxa"/>
-          </w:tcPr>
-          <w:p>
-            <w:r>
-              <w:t>Radije</w:t>
-            </w:r>
-          </w:p>
-        </w:tc>
-      </w:tr>
-      <w:tr>
-        <w:tc>
-          <w:tcPr>
-            <w:tcW w:w="682" w:type="dxa"/>
-          </w:tcPr>
-          <w:p>
-            <w:pPr>
-              <w:jc w:val="center"/>
-              <w:rPr>
-                <w:b/>
-                <w:bCs/>
-                <w:lang w:val="de-DE"/>
-              </w:rPr>
-            </w:pPr>
-            <w:r>
-              <w:rPr>
-                <w:b/>
-                <w:bCs/>
-                <w:lang w:val="de-DE"/>
-              </w:rPr>
               <w:t>39</w:t>
             </w:r>
           </w:p>
@@ -3742,6 +3742,7 @@
                 <w:bCs/>
               </w:rPr>
             </w:pPr>
+            <w:bookmarkStart w:id="0" w:name="_Hlk160200661"/>
             <w:r>
               <w:rPr>
                 <w:b/>
@@ -5090,7 +5091,6 @@
                 <w:b/>
                 <w:bCs/>
               </w:rPr>
-              <w:lastRenderedPageBreak/>
               <w:t>65</w:t>
             </w:r>
           </w:p>
@@ -5155,6 +5155,7 @@
           </w:p>
         </w:tc>
       </w:tr>
+      <w:bookmarkEnd w:id="0"/>
       <w:tr>
         <w:tc>
           <w:tcPr>
@@ -5424,7 +5425,7 @@
     <w:p/>
     <w:sectPr>
       <w:pgSz w:w="12240" w:h="15840"/>
-      <w:pgMar w:top="1440" w:right="1440" w:bottom="1440" w:left="1440" w:header="720" w:footer="720" w:gutter="0"/>
+      <w:pgMar w:top="720" w:right="720" w:bottom="720" w:left="720" w:header="720" w:footer="720" w:gutter="0"/>
       <w:cols w:space="720"/>
       <w:docGrid w:linePitch="360"/>
     </w:sectPr>

</xml_diff>